<commit_message>
feat(resume): stack contacts vertically and serve downloads in dev
</commit_message>
<xml_diff>
--- a/generated/en/docx/creative-tech.docx
+++ b/generated/en/docx/creative-tech.docx
@@ -30,6 +30,30 @@
     </w:p>
     <w:p>
       <w:pPr>
+        <w:spacing w:after="80"/>
+      </w:pPr>
+      <w:r>
+        <w:rPr>
+          <w:i w:val="false"/>
+          <w:iCs w:val="false"/>
+        </w:rPr>
+        <w:t xml:space="preserve">Medellín, Colombia + Remote</w:t>
+      </w:r>
+    </w:p>
+    <w:p>
+      <w:pPr>
+        <w:spacing w:after="80"/>
+      </w:pPr>
+      <w:r>
+        <w:rPr>
+          <w:i w:val="false"/>
+          <w:iCs w:val="false"/>
+        </w:rPr>
+        <w:t xml:space="preserve">santiago@orozcoh.com · https://linkedin.com/in/orozcoh/ · https://github.com/orozcoh</w:t>
+      </w:r>
+    </w:p>
+    <w:p>
+      <w:pPr>
         <w:spacing w:after="200"/>
       </w:pPr>
       <w:r>
@@ -37,7 +61,7 @@
           <w:i w:val="false"/>
           <w:iCs w:val="false"/>
         </w:rPr>
-        <w:t xml:space="preserve">Medellín, Colombia + Remote · santiago@orozcoh.com · https://www.linkedin.com/in/orozcoh/ · https://github.com/orozcoh · https://santiago.orozcoh.com · https://cv.orozcoh.com</w:t>
+        <w:t xml:space="preserve">https://santiago.orozcoh.com · https://cv.orozcoh.com</w:t>
       </w:r>
     </w:p>
     <w:p>
@@ -58,7 +82,7 @@
           <w:i w:val="false"/>
           <w:iCs w:val="false"/>
         </w:rPr>
-        <w:t xml:space="preserve">Engineer and creative technologist building real-time interactive experiences — WebGL renderers, generative systems, and collaborative creative tools with production-grade engineering underneath.</w:t>
+        <w:t xml:space="preserve">Software Engineer with an Electronics Engineering background, passionate about building technology that connects software with interactive experiences. Experienced in developing web applications, cloud services, and tools for creative workflows, with interests spanning TouchDesigner, interactive installations, telemetry systems, and AI-assisted development.</w:t>
       </w:r>
     </w:p>
     <w:p>
@@ -192,7 +216,7 @@
         <w:spacing w:after="80" w:before="240"/>
       </w:pPr>
       <w:r>
-        <w:t xml:space="preserve">career-os</w:t>
+        <w:t xml:space="preserve">Anthology</w:t>
       </w:r>
     </w:p>
     <w:p>
@@ -204,56 +228,43 @@
           <w:i/>
           <w:iCs/>
         </w:rPr>
-        <w:t xml:space="preserve">Resume infrastructure as software</w:t>
-      </w:r>
-    </w:p>
-    <w:p>
-      <w:pPr>
-        <w:spacing w:after="80"/>
-      </w:pPr>
-      <w:r>
-        <w:rPr>
-          <w:i w:val="false"/>
-          <w:iCs w:val="false"/>
-        </w:rPr>
-        <w:t xml:space="preserve">Single source of truth for professional identity. Structured YAML data compiles into ATS-friendly PDF, HTML, DOCX, and Markdown resumes plus a static website.</w:t>
-      </w:r>
-    </w:p>
-    <w:p>
-      <w:pPr>
-        <w:pStyle w:val="ListParagraph"/>
-        <w:numPr>
-          <w:ilvl w:val="0"/>
-          <w:numId w:val="1"/>
-        </w:numPr>
-        <w:spacing w:after="40"/>
-      </w:pPr>
-      <w:r>
-        <w:t xml:space="preserve">Headless-Chromium print pipeline produces machine-readable, ATS-parseable PDFs from the same HTML the site serves.</w:t>
-      </w:r>
-    </w:p>
-    <w:p>
-      <w:pPr>
-        <w:spacing w:after="80"/>
-      </w:pPr>
-      <w:r>
-        <w:rPr>
-          <w:i w:val="false"/>
-          <w:iCs w:val="false"/>
-        </w:rPr>
-        <w:t xml:space="preserve">Technologies: Astro, TypeScript, Tailwind CSS, Zod, Playwright, pnpm</w:t>
-      </w:r>
-    </w:p>
-    <w:p>
-      <w:pPr>
-        <w:spacing w:after="80"/>
-      </w:pPr>
-      <w:r>
-        <w:rPr>
-          <w:i w:val="false"/>
-          <w:iCs w:val="false"/>
-        </w:rPr>
-        <w:t xml:space="preserve">Links: Source (https://github.com/orozcoh/career-os)</w:t>
+        <w:t xml:space="preserve">Local-first knowledge management platform</w:t>
+      </w:r>
+    </w:p>
+    <w:p>
+      <w:pPr>
+        <w:spacing w:after="80"/>
+      </w:pPr>
+      <w:r>
+        <w:rPr>
+          <w:i w:val="false"/>
+          <w:iCs w:val="false"/>
+        </w:rPr>
+        <w:t xml:space="preserve">A Progressive Web Application for capturing, organizing, and sharing personal knowledge. Built around local-first principles, with optional blockchain publication and QR-based sharing, allowing users to retain ownership of their data while selectively making content public.</w:t>
+      </w:r>
+    </w:p>
+    <w:p>
+      <w:pPr>
+        <w:spacing w:after="80"/>
+      </w:pPr>
+      <w:r>
+        <w:rPr>
+          <w:i w:val="false"/>
+          <w:iCs w:val="false"/>
+        </w:rPr>
+        <w:t xml:space="preserve">Technologies: React, TypeScript, Progressive Web App, Cloudflare Workers, Blockchain</w:t>
+      </w:r>
+    </w:p>
+    <w:p>
+      <w:pPr>
+        <w:spacing w:after="80"/>
+      </w:pPr>
+      <w:r>
+        <w:rPr>
+          <w:i w:val="false"/>
+          <w:iCs w:val="false"/>
+        </w:rPr>
+        <w:t xml:space="preserve">Links: Live (https://memory.inbytes.xyz)</w:t>
       </w:r>
     </w:p>
     <w:p>
@@ -262,7 +273,7 @@
         <w:spacing w:after="80" w:before="240"/>
       </w:pPr>
       <w:r>
-        <w:t xml:space="preserve">Shader Sketches</w:t>
+        <w:t xml:space="preserve">TD Status</w:t>
       </w:r>
     </w:p>
     <w:p>
@@ -274,152 +285,56 @@
           <w:i/>
           <w:iCs/>
         </w:rPr>
-        <w:t xml:space="preserve">Generative art in the browser</w:t>
-      </w:r>
-    </w:p>
-    <w:p>
-      <w:pPr>
-        <w:spacing w:after="80"/>
-      </w:pPr>
-      <w:r>
-        <w:rPr>
-          <w:i w:val="false"/>
-          <w:iCs w:val="false"/>
-        </w:rPr>
-        <w:t xml:space="preserve">A collection of interactive GLSL sketches exploring noise fields, particle systems, and audio-reactive visuals, packaged as embeddable web components.</w:t>
-      </w:r>
-    </w:p>
-    <w:p>
-      <w:pPr>
-        <w:pStyle w:val="ListParagraph"/>
-        <w:numPr>
-          <w:ilvl w:val="0"/>
-          <w:numId w:val="1"/>
-        </w:numPr>
-        <w:spacing w:after="40"/>
-      </w:pPr>
-      <w:r>
-        <w:t xml:space="preserve">60fps particle systems with 100k+ particles via GPU instancing.</w:t>
-      </w:r>
-    </w:p>
-    <w:p>
-      <w:pPr>
-        <w:pStyle w:val="ListParagraph"/>
-        <w:numPr>
-          <w:ilvl w:val="0"/>
-          <w:numId w:val="1"/>
-        </w:numPr>
-        <w:spacing w:after="40"/>
-      </w:pPr>
-      <w:r>
-        <w:t xml:space="preserve">Featured in an online generative-art showcase with 20k visitors.</w:t>
-      </w:r>
-    </w:p>
-    <w:p>
-      <w:pPr>
-        <w:spacing w:after="80"/>
-      </w:pPr>
-      <w:r>
-        <w:rPr>
-          <w:i w:val="false"/>
-          <w:iCs w:val="false"/>
-        </w:rPr>
-        <w:t xml:space="preserve">Technologies: WebGL, GLSL, TypeScript, Vite</w:t>
-      </w:r>
-    </w:p>
-    <w:p>
-      <w:pPr>
-        <w:spacing w:after="80"/>
-      </w:pPr>
-      <w:r>
-        <w:rPr>
-          <w:i w:val="false"/>
-          <w:iCs w:val="false"/>
-        </w:rPr>
-        <w:t xml:space="preserve">Links: Live (https://example.com/shaders) · Source (https://github.com/example/shader-sketches)</w:t>
-      </w:r>
-    </w:p>
-    <w:p>
-      <w:pPr>
-        <w:pStyle w:val="Heading1"/>
-        <w:spacing w:after="80" w:before="240"/>
-      </w:pPr>
-      <w:r>
-        <w:t xml:space="preserve">Skills</w:t>
-      </w:r>
-    </w:p>
-    <w:p>
-      <w:pPr>
-        <w:pStyle w:val="ListParagraph"/>
-        <w:numPr>
-          <w:ilvl w:val="0"/>
-          <w:numId w:val="1"/>
-        </w:numPr>
-        <w:spacing w:after="40"/>
-      </w:pPr>
-      <w:r>
-        <w:t xml:space="preserve">Languages: TypeScript, JavaScript</w:t>
-      </w:r>
-    </w:p>
-    <w:p>
-      <w:pPr>
-        <w:pStyle w:val="ListParagraph"/>
-        <w:numPr>
-          <w:ilvl w:val="0"/>
-          <w:numId w:val="1"/>
-        </w:numPr>
-        <w:spacing w:after="40"/>
-      </w:pPr>
-      <w:r>
-        <w:t xml:space="preserve">Frontend: React, Astro, Tailwind CSS, Accessibility (WCAG)</w:t>
-      </w:r>
-    </w:p>
-    <w:p>
-      <w:pPr>
-        <w:pStyle w:val="ListParagraph"/>
-        <w:numPr>
-          <w:ilvl w:val="0"/>
-          <w:numId w:val="1"/>
-        </w:numPr>
-        <w:spacing w:after="40"/>
-      </w:pPr>
-      <w:r>
-        <w:t xml:space="preserve">Backend &amp; Infrastructure: Node.js, Cloudflare Workers</w:t>
-      </w:r>
-    </w:p>
-    <w:p>
-      <w:pPr>
-        <w:pStyle w:val="ListParagraph"/>
-        <w:numPr>
-          <w:ilvl w:val="0"/>
-          <w:numId w:val="1"/>
-        </w:numPr>
-        <w:spacing w:after="40"/>
-      </w:pPr>
-      <w:r>
-        <w:t xml:space="preserve">Creative Technology: WebGL / GLSL, Canvas 2D, Generative art, Web Audio API</w:t>
-      </w:r>
-    </w:p>
-    <w:p>
-      <w:pPr>
-        <w:pStyle w:val="ListParagraph"/>
-        <w:numPr>
-          <w:ilvl w:val="0"/>
-          <w:numId w:val="1"/>
-        </w:numPr>
-        <w:spacing w:after="40"/>
-      </w:pPr>
-      <w:r>
-        <w:t xml:space="preserve">Practices: Testing (unit, contract, e2e), Technical writing &amp; RFCs</w:t>
-      </w:r>
-    </w:p>
-    <w:p>
-      <w:pPr>
-        <w:pStyle w:val="Heading1"/>
-        <w:spacing w:after="80" w:before="240"/>
-      </w:pPr>
-      <w:r>
-        <w:t xml:space="preserve">Education</w:t>
+        <w:t xml:space="preserve">Cloud licensing and telemetry platform for TouchDesigner</w:t>
+      </w:r>
+    </w:p>
+    <w:p>
+      <w:pPr>
+        <w:spacing w:after="80"/>
+      </w:pPr>
+      <w:r>
+        <w:rPr>
+          <w:i w:val="false"/>
+          <w:iCs w:val="false"/>
+        </w:rPr>
+        <w:t xml:space="preserve">Cloud platform for managing software licenses and monitoring TouchDesigner deployments. Provides customer management, heartbeat telemetry, license validation, and operational visibility through Cloudflare Workers and KV.</w:t>
+      </w:r>
+    </w:p>
+    <w:p>
+      <w:pPr>
+        <w:pStyle w:val="ListParagraph"/>
+        <w:numPr>
+          <w:ilvl w:val="0"/>
+          <w:numId w:val="1"/>
+        </w:numPr>
+        <w:spacing w:after="40"/>
+      </w:pPr>
+      <w:r>
+        <w:t xml:space="preserve">Implemented heartbeat telemetry for remote monitoring of deployed interactive experiences.</w:t>
+      </w:r>
+    </w:p>
+    <w:p>
+      <w:pPr>
+        <w:spacing w:after="80"/>
+      </w:pPr>
+      <w:r>
+        <w:rPr>
+          <w:i w:val="false"/>
+          <w:iCs w:val="false"/>
+        </w:rPr>
+        <w:t xml:space="preserve">Technologies: React, TypeScript, Cloudflare Workers, Cloudflare KV, REST API</w:t>
+      </w:r>
+    </w:p>
+    <w:p>
+      <w:pPr>
+        <w:spacing w:after="80"/>
+      </w:pPr>
+      <w:r>
+        <w:rPr>
+          <w:i w:val="false"/>
+          <w:iCs w:val="false"/>
+        </w:rPr>
+        <w:t xml:space="preserve">Links: Live (https://td-status.inbytes.xyz)</w:t>
       </w:r>
     </w:p>
     <w:p>
@@ -428,7 +343,7 @@
         <w:spacing w:after="80" w:before="240"/>
       </w:pPr>
       <w:r>
-        <w:t xml:space="preserve">Bachelor's Degree Electronics Engineering — Universidad de Antioquia</w:t>
+        <w:t xml:space="preserve">Prompter</w:t>
       </w:r>
     </w:p>
     <w:p>
@@ -440,6 +355,120 @@
           <w:i/>
           <w:iCs/>
         </w:rPr>
+        <w:t xml:space="preserve">AI image generation with crypto micropayments</w:t>
+      </w:r>
+    </w:p>
+    <w:p>
+      <w:pPr>
+        <w:spacing w:after="80"/>
+      </w:pPr>
+      <w:r>
+        <w:rPr>
+          <w:i w:val="false"/>
+          <w:iCs w:val="false"/>
+        </w:rPr>
+        <w:t xml:space="preserve">AI image generation platform that transforms user images using curated prompts while accepting USDC payments through the x402 protocol. Designed without user accounts or traditional payment processing, prioritizing simplicity and privacy.</w:t>
+      </w:r>
+    </w:p>
+    <w:p>
+      <w:pPr>
+        <w:spacing w:after="80"/>
+      </w:pPr>
+      <w:r>
+        <w:rPr>
+          <w:i w:val="false"/>
+          <w:iCs w:val="false"/>
+        </w:rPr>
+        <w:t xml:space="preserve">Technologies: React, TypeScript, Cloudflare Workers, Cloudflare KV, Generative AI, x402</w:t>
+      </w:r>
+    </w:p>
+    <w:p>
+      <w:pPr>
+        <w:spacing w:after="80"/>
+      </w:pPr>
+      <w:r>
+        <w:rPr>
+          <w:i w:val="false"/>
+          <w:iCs w:val="false"/>
+        </w:rPr>
+        <w:t xml:space="preserve">Links: Live (https://ai.digitalerror.xyz) · Source (https://github.com/orozcoh/prompter)</w:t>
+      </w:r>
+    </w:p>
+    <w:p>
+      <w:pPr>
+        <w:pStyle w:val="Heading1"/>
+        <w:spacing w:after="80" w:before="240"/>
+      </w:pPr>
+      <w:r>
+        <w:t xml:space="preserve">Skills</w:t>
+      </w:r>
+    </w:p>
+    <w:p>
+      <w:pPr>
+        <w:pStyle w:val="ListParagraph"/>
+        <w:numPr>
+          <w:ilvl w:val="0"/>
+          <w:numId w:val="1"/>
+        </w:numPr>
+        <w:spacing w:after="40"/>
+      </w:pPr>
+      <w:r>
+        <w:t xml:space="preserve">Programming Languages: TypeScript, JavaScript</w:t>
+      </w:r>
+    </w:p>
+    <w:p>
+      <w:pPr>
+        <w:pStyle w:val="ListParagraph"/>
+        <w:numPr>
+          <w:ilvl w:val="0"/>
+          <w:numId w:val="1"/>
+        </w:numPr>
+        <w:spacing w:after="40"/>
+      </w:pPr>
+      <w:r>
+        <w:t xml:space="preserve">Frontend Development: React, Progressive Web Apps (PWA), HTML5, CSS3, Tailwind CSS</w:t>
+      </w:r>
+    </w:p>
+    <w:p>
+      <w:pPr>
+        <w:pStyle w:val="ListParagraph"/>
+        <w:numPr>
+          <w:ilvl w:val="0"/>
+          <w:numId w:val="1"/>
+        </w:numPr>
+        <w:spacing w:after="40"/>
+      </w:pPr>
+      <w:r>
+        <w:t xml:space="preserve">Creative Technology: TouchDesigner, Interactive Installations, Licensing Systems, Telemetry Systems</w:t>
+      </w:r>
+    </w:p>
+    <w:p>
+      <w:pPr>
+        <w:pStyle w:val="Heading1"/>
+        <w:spacing w:after="80" w:before="240"/>
+      </w:pPr>
+      <w:r>
+        <w:t xml:space="preserve">Education</w:t>
+      </w:r>
+    </w:p>
+    <w:p>
+      <w:pPr>
+        <w:pStyle w:val="Heading2"/>
+        <w:spacing w:after="80" w:before="240"/>
+      </w:pPr>
+      <w:r>
+        <w:t xml:space="preserve">Bachelor's Degree Electronics Engineering — Universidad de Antioquia</w:t>
+      </w:r>
+    </w:p>
+    <w:p>
+      <w:pPr>
+        <w:spacing w:after="80"/>
+      </w:pPr>
+      <w:r>
+        <w:rPr>
+          <w:i/>
+          <w:iCs/>
+        </w:rPr>
         <w:t xml:space="preserve">Aug 2014 – Jun 2023 · Medellín, Colombia</w:t>
       </w:r>
     </w:p>
@@ -514,7 +543,7 @@
         <w:spacing w:after="40"/>
       </w:pPr>
       <w:r>
-        <w:t xml:space="preserve">English — Fluent</w:t>
+        <w:t xml:space="preserve">English — Fluent - B2</w:t>
       </w:r>
     </w:p>
     <w:sectPr>

</xml_diff>

<commit_message>
feat: shorten role-targeted resumes with compact project layouts
</commit_message>
<xml_diff>
--- a/generated/en/docx/creative-tech.docx
+++ b/generated/en/docx/creative-tech.docx
@@ -82,7 +82,7 @@
           <w:i w:val="false"/>
           <w:iCs w:val="false"/>
         </w:rPr>
-        <w:t xml:space="preserve">Software Engineer with an Electronics Engineering background, passionate about building technology that connects software with interactive experiences. Experienced in developing web applications, cloud services, and tools for creative workflows, with interests spanning TouchDesigner, interactive installations, telemetry systems, and AI-assisted development.</w:t>
+        <w:t xml:space="preserve">Software Engineer with an Electronics Engineering background, passionate about connecting software with interactive experiences. Experienced in web applications, cloud services, and tools for creative workflows, spanning TouchDesigner, interactive installations, telemetry systems, and AI-assisted development.</w:t>
       </w:r>
     </w:p>
     <w:p>
@@ -125,20 +125,33 @@
         <w:spacing w:after="40"/>
       </w:pPr>
       <w:r>
-        <w:t xml:space="preserve">Built Progressive Web Applications (PWAs) with a focus on mobile-first experiences, local-first principles, and maintainable software architecture.</w:t>
-      </w:r>
-    </w:p>
-    <w:p>
-      <w:pPr>
-        <w:pStyle w:val="ListParagraph"/>
-        <w:numPr>
-          <w:ilvl w:val="0"/>
-          <w:numId w:val="1"/>
-        </w:numPr>
-        <w:spacing w:after="40"/>
-      </w:pPr>
-      <w:r>
-        <w:t xml:space="preserve">Built interactive software experiences integrating TouchDesigner licensing, telemetry collection, and cloud-based license management.</w:t>
+        <w:t xml:space="preserve">Designed, built, and deployed production-ready web applications from concept to deployment.</w:t>
+      </w:r>
+    </w:p>
+    <w:p>
+      <w:pPr>
+        <w:pStyle w:val="ListParagraph"/>
+        <w:numPr>
+          <w:ilvl w:val="0"/>
+          <w:numId w:val="1"/>
+        </w:numPr>
+        <w:spacing w:after="40"/>
+      </w:pPr>
+      <w:r>
+        <w:t xml:space="preserve">Developed cloud-native applications using React, TypeScript, Progressive Web App technologies, and Cloudflare's edge platform.</w:t>
+      </w:r>
+    </w:p>
+    <w:p>
+      <w:pPr>
+        <w:pStyle w:val="ListParagraph"/>
+        <w:numPr>
+          <w:ilvl w:val="0"/>
+          <w:numId w:val="1"/>
+        </w:numPr>
+        <w:spacing w:after="40"/>
+      </w:pPr>
+      <w:r>
+        <w:t xml:space="preserve">Built cloud-connected tooling for interactive experiences, including licensing and telemetry systems for TouchDesigner deployments.</w:t>
       </w:r>
     </w:p>
     <w:p>
@@ -159,7 +172,7 @@
           <w:i/>
           <w:iCs/>
         </w:rPr>
-        <w:t xml:space="preserve">Oct 2022 – May 2023 · Medellín, Colombia · Internship</w:t>
+        <w:t xml:space="preserve">Oct 2022 – May 2023 · Remote · Internship</w:t>
       </w:r>
     </w:p>
     <w:p>
@@ -252,7 +265,7 @@
           <w:i w:val="false"/>
           <w:iCs w:val="false"/>
         </w:rPr>
-        <w:t xml:space="preserve">Technologies: React, TypeScript, Progressive Web App, Cloudflare Workers, Blockchain</w:t>
+        <w:t xml:space="preserve">Technologies: React, TypeScript, Cloudflare Workers</w:t>
       </w:r>
     </w:p>
     <w:p>
@@ -310,19 +323,19 @@
         <w:spacing w:after="40"/>
       </w:pPr>
       <w:r>
-        <w:t xml:space="preserve">Implemented heartbeat telemetry for remote monitoring of deployed interactive experiences.</w:t>
-      </w:r>
-    </w:p>
-    <w:p>
-      <w:pPr>
-        <w:spacing w:after="80"/>
-      </w:pPr>
-      <w:r>
-        <w:rPr>
-          <w:i w:val="false"/>
-          <w:iCs w:val="false"/>
-        </w:rPr>
-        <w:t xml:space="preserve">Technologies: React, TypeScript, Cloudflare Workers, Cloudflare KV, REST API</w:t>
+        <w:t xml:space="preserve">Built a cloud-based licensing system with heartbeat telemetry for monitoring TouchDesigner deployments.</w:t>
+      </w:r>
+    </w:p>
+    <w:p>
+      <w:pPr>
+        <w:spacing w:after="80"/>
+      </w:pPr>
+      <w:r>
+        <w:rPr>
+          <w:i w:val="false"/>
+          <w:iCs w:val="false"/>
+        </w:rPr>
+        <w:t xml:space="preserve">Technologies: React, TypeScript, Cloudflare Workers</w:t>
       </w:r>
     </w:p>
     <w:p>
@@ -379,7 +392,7 @@
           <w:i w:val="false"/>
           <w:iCs w:val="false"/>
         </w:rPr>
-        <w:t xml:space="preserve">Technologies: React, TypeScript, Cloudflare Workers, Cloudflare KV, Generative AI, x402</w:t>
+        <w:t xml:space="preserve">Technologies: React, TypeScript, Cloudflare Workers</w:t>
       </w:r>
     </w:p>
     <w:p>
@@ -470,45 +483,6 @@
           <w:iCs/>
         </w:rPr>
         <w:t xml:space="preserve">Aug 2014 – Jun 2023 · Medellín, Colombia</w:t>
-      </w:r>
-    </w:p>
-    <w:p>
-      <w:pPr>
-        <w:pStyle w:val="ListParagraph"/>
-        <w:numPr>
-          <w:ilvl w:val="0"/>
-          <w:numId w:val="1"/>
-        </w:numPr>
-        <w:spacing w:after="40"/>
-      </w:pPr>
-      <w:r>
-        <w:t xml:space="preserve">Developed a strong foundation in software engineering, embedded systems, electronics, mathematics, and computer architecture.</w:t>
-      </w:r>
-    </w:p>
-    <w:p>
-      <w:pPr>
-        <w:pStyle w:val="ListParagraph"/>
-        <w:numPr>
-          <w:ilvl w:val="0"/>
-          <w:numId w:val="1"/>
-        </w:numPr>
-        <w:spacing w:after="40"/>
-      </w:pPr>
-      <w:r>
-        <w:t xml:space="preserve">Completed an engineering internship focused on modern web development, TypeScript migration, and reusable component libraries.</w:t>
-      </w:r>
-    </w:p>
-    <w:p>
-      <w:pPr>
-        <w:pStyle w:val="ListParagraph"/>
-        <w:numPr>
-          <w:ilvl w:val="0"/>
-          <w:numId w:val="1"/>
-        </w:numPr>
-        <w:spacing w:after="40"/>
-      </w:pPr>
-      <w:r>
-        <w:t xml:space="preserve">Transitioned academic interests toward software engineering through independent product development and modern web technologies.</w:t>
       </w:r>
     </w:p>
     <w:p>

</xml_diff>